<commit_message>
Propagate corrected numbers everywhere; review notes for Rutu
- README: corrected counts throughout, new 4.8 (missing-code bug),
  results 9.1-9.8 rebuilt on corrected data (26 features), conformal
  and transition sections with known issues, label-fragility findings,
  updated status/next steps/limitations, decisions 19-20
- docs: preprocessing methods (new 5b), transition design, model card,
  proposals trace, architecture, clinical need, conformal, orchestrator,
  config.yaml
- dataset_figures.py now computes every number from the data; both
  figures regenerated
- paper v7: section 5 numbers corrected, missing-data-codes paragraph,
  GENETIC_COHORT marked excluded
- slides: slides 8, 10, 11 corrected; slide-10 figure replaced
- HANDOFF_README: stale-results banner
- docs/NEXT_STEPS_RUTU.md: ordered fix list from the 28 Sep review
</commit_message>
<xml_diff>
--- a/reports/paper/TRACE-PD_paper_draft_v7.docx
+++ b/reports/paper/TRACE-PD_paper_draft_v7.docx
@@ -4736,7 +4736,7 @@
                 <w:szCs w:val="18"/>
                 <w:rtl w:val="0"/>
               </w:rPr>
-              <w:t xml:space="preserve">27</w:t>
+              <w:t>26</w:t>
             </w:r>
           </w:p>
         </w:tc>
@@ -4925,7 +4925,7 @@
                 <w:szCs w:val="18"/>
                 <w:rtl w:val="0"/>
               </w:rPr>
-              <w:t xml:space="preserve">9</w:t>
+              <w:t>10</w:t>
             </w:r>
           </w:p>
         </w:tc>
@@ -6146,7 +6146,7 @@
                 <w:szCs w:val="15"/>
                 <w:rtl w:val="0"/>
               </w:rPr>
-              <w:t xml:space="preserve">X — predictor</w:t>
+              <w:t>Excluded — admin</w:t>
             </w:r>
           </w:p>
         </w:tc>
@@ -6188,7 +6188,7 @@
                 <w:szCs w:val="15"/>
                 <w:rtl w:val="0"/>
               </w:rPr>
-              <w:t xml:space="preserve">Recruited into the genetic cohort (see limitation below)</w:t>
+              <w:t>Recruited into the genetic cohort (recruitment-arm flag; removed from X)</w:t>
             </w:r>
           </w:p>
         </w:tc>
@@ -12156,7 +12156,7 @@
                 <w:szCs w:val="18"/>
                 <w:rtl w:val="0"/>
               </w:rPr>
-              <w:t xml:space="preserve">5,742 (83.0%)</w:t>
+              <w:t>5,638 (81.5%)</w:t>
             </w:r>
           </w:p>
         </w:tc>
@@ -13182,7 +13182,7 @@
           <w:szCs w:val="22"/>
           <w:rtl w:val="0"/>
         </w:rPr>
-        <w:t xml:space="preserve"> A label is assigned only when all 16 items are present, so no label derives from a partial mean; 17% of rows therefore remain unlabelled, concentrated at later visits where the motor exam was not administered.</w:t>
+        <w:t xml:space="preserve"> A label is assigned only when all 16 items are present, so no label derives from a partial mean; 18.5% of rows therefore remain unlabelled, concentrated at later visits where the motor exam was not administered.</w:t>
       </w:r>
     </w:p>
     <w:p>
@@ -13203,7 +13203,7 @@
           <w:szCs w:val="22"/>
           <w:rtl w:val="0"/>
         </w:rPr>
-        <w:t xml:space="preserve">Undefined ratio.</w:t>
+        <w:t xml:space="preserve">Missing-data codes. </w:t>
       </w:r>
       <w:r>
         <w:rPr>
@@ -13211,7 +13211,7 @@
           <w:szCs w:val="22"/>
           <w:rtl w:val="0"/>
         </w:rPr>
-        <w:t xml:space="preserve"> Where the PIGD score is zero, the row is assigned TD if the tremor score is positive and indeterminate if both are zero. This affects 845 rows (14.7% of labelled rows) and warrants a sensitivity analysis.</w:t>
+        <w:t>PPMI records ‘unable to rate’ in Part III as the numeric code 101 and ‘not applicable’ in SCOPA-AUT as 9. Both are converted to missing before any score is computed; left in place, 101 had been averaged into the PIGD score and mislabelled 104 visits.</w:t>
       </w:r>
     </w:p>
     <w:p>
@@ -13232,7 +13232,7 @@
           <w:szCs w:val="22"/>
           <w:rtl w:val="0"/>
         </w:rPr>
-        <w:t xml:space="preserve">Verification.</w:t>
+        <w:t xml:space="preserve">Undefined ratio.</w:t>
       </w:r>
       <w:r>
         <w:rPr>
@@ -13240,7 +13240,36 @@
           <w:szCs w:val="22"/>
           <w:rtl w:val="0"/>
         </w:rPr>
-        <w:t xml:space="preserve"> Every label was recomputed independently from its two component scores: 0 mismatches across all 5,742 labelled rows.</w:t>
+        <w:t xml:space="preserve"> Where the PIGD score is zero, the row is assigned TD if the tremor score is positive and indeterminate if both are zero. This affects 845 rows (15.0% of labelled rows) and warrants a sensitivity analysis.</w:t>
+      </w:r>
+    </w:p>
+    <w:p>
+      <w:pPr>
+        <w:numPr>
+          <w:ilvl w:val="0"/>
+          <w:numId w:val="90"/>
+        </w:numPr>
+        <w:spacing w:line="264" w:lineRule="auto"/>
+        <w:ind w:left="420" w:hanging="260"/>
+        <w:jc w:val="both"/>
+      </w:pPr>
+      <w:r>
+        <w:rPr>
+          <w:b w:val="1"/>
+          <w:bCs w:val="1"/>
+          <w:sz w:val="22"/>
+          <w:szCs w:val="22"/>
+          <w:rtl w:val="0"/>
+        </w:rPr>
+        <w:t xml:space="preserve">Verification.</w:t>
+      </w:r>
+      <w:r>
+        <w:rPr>
+          <w:sz w:val="22"/>
+          <w:szCs w:val="22"/>
+          <w:rtl w:val="0"/>
+        </w:rPr>
+        <w:t xml:space="preserve"> Every label was recomputed independently from its two component scores: 0 mismatches across all 5,638 labelled rows.</w:t>
       </w:r>
     </w:p>
     <w:p>
@@ -13271,7 +13300,7 @@
           <w:szCs w:val="24"/>
           <w:rtl w:val="0"/>
         </w:rPr>
-        <w:t xml:space="preserve">The label is a deterministic function of 16 MDS-UPDRS items, so a model permitted to see them would re-derive arithmetic rather than learn. Supplying them raises accuracy to 0.906 while measuring nothing of interest. Feature eligibility is therefore enforced programmatically, and the script aborts if a banned column reaches a feature group.</w:t>
+        <w:t>The label is a deterministic function of 16 MDS-UPDRS items, so a model permitted to see them would re-derive arithmetic rather than learn. Supplying them raises accuracy to 0.905 while measuring nothing of interest. Feature eligibility is therefore enforced programmatically, and the script aborts if a banned column reaches a feature group.</w:t>
       </w:r>
     </w:p>
     <w:tbl>
@@ -13678,7 +13707,7 @@
                 <w:szCs w:val="18"/>
                 <w:rtl w:val="0"/>
               </w:rPr>
-              <w:t xml:space="preserve">27</w:t>
+              <w:t>26</w:t>
             </w:r>
           </w:p>
         </w:tc>
@@ -13848,7 +13877,7 @@
           <w:szCs w:val="24"/>
           <w:rtl w:val="0"/>
         </w:rPr>
-        <w:t xml:space="preserve">Each visit is paired with the following scheduled visit to derive the transition target (4,918 consecutive pairs with both labels known).</w:t>
+        <w:t>Each visit is paired with the following scheduled visit to derive the transition target (4,818 consecutive pairs with both labels known).</w:t>
       </w:r>
     </w:p>
     <w:tbl>
@@ -13984,7 +14013,7 @@
                 <w:szCs w:val="18"/>
                 <w:rtl w:val="0"/>
               </w:rPr>
-              <w:t xml:space="preserve">20.9%</w:t>
+              <w:t>20.2%</w:t>
             </w:r>
           </w:p>
         </w:tc>
@@ -14004,7 +14033,7 @@
                 <w:szCs w:val="18"/>
                 <w:rtl w:val="0"/>
               </w:rPr>
-              <w:t xml:space="preserve">2,744</w:t>
+              <w:t>2,722</w:t>
             </w:r>
           </w:p>
         </w:tc>
@@ -14046,7 +14075,7 @@
                 <w:szCs w:val="18"/>
                 <w:rtl w:val="0"/>
               </w:rPr>
-              <w:t xml:space="preserve">27.1%</w:t>
+              <w:t>27.0%</w:t>
             </w:r>
           </w:p>
         </w:tc>
@@ -14066,7 +14095,7 @@
                 <w:szCs w:val="18"/>
                 <w:rtl w:val="0"/>
               </w:rPr>
-              <w:t xml:space="preserve">1,629</w:t>
+              <w:t>1,555</w:t>
             </w:r>
           </w:p>
         </w:tc>
@@ -14108,7 +14137,7 @@
                 <w:szCs w:val="18"/>
                 <w:rtl w:val="0"/>
               </w:rPr>
-              <w:t xml:space="preserve">76.3%</w:t>
+              <w:t>76.2%</w:t>
             </w:r>
           </w:p>
         </w:tc>
@@ -14128,7 +14157,7 @@
                 <w:szCs w:val="18"/>
                 <w:rtl w:val="0"/>
               </w:rPr>
-              <w:t xml:space="preserve">545</w:t>
+              <w:t>541</w:t>
             </w:r>
           </w:p>
         </w:tc>
@@ -14170,7 +14199,7 @@
                 <w:szCs w:val="18"/>
                 <w:rtl w:val="0"/>
               </w:rPr>
-              <w:t xml:space="preserve">29.1%</w:t>
+              <w:t>28.7%</w:t>
             </w:r>
           </w:p>
         </w:tc>
@@ -14190,7 +14219,7 @@
                 <w:szCs w:val="18"/>
                 <w:rtl w:val="0"/>
               </w:rPr>
-              <w:t xml:space="preserve">4,918</w:t>
+              <w:t>4,818</w:t>
             </w:r>
           </w:p>
         </w:tc>
@@ -14226,7 +14255,7 @@
           <w:szCs w:val="22"/>
           <w:rtl w:val="0"/>
         </w:rPr>
-        <w:t xml:space="preserve">355 of 439 patients (80.9%) change label at least once.</w:t>
+        <w:t>344 of 439 patients (78.4%) change label at least once.</w:t>
       </w:r>
     </w:p>
     <w:p>
@@ -14310,7 +14339,7 @@
           <w:szCs w:val="22"/>
           <w:rtl w:val="0"/>
         </w:rPr>
-        <w:t xml:space="preserve"> 52.6% TD, 36.6% PIGD, 10.8% indeterminate at visit level, requiring class weighting and per-class reporting rather than aggregate accuracy.</w:t>
+        <w:t xml:space="preserve"> 53.5% TD, 35.5% PIGD, 11.0% indeterminate at visit level, requiring class weighting and per-class reporting rather than aggregate accuracy.</w:t>
       </w:r>
     </w:p>
     <w:p>
@@ -14824,7 +14853,7 @@
                 <w:szCs w:val="18"/>
                 <w:rtl w:val="0"/>
               </w:rPr>
-              <w:t xml:space="preserve">275</w:t>
+              <w:t>269</w:t>
             </w:r>
           </w:p>
         </w:tc>
@@ -14906,7 +14935,7 @@
                 <w:szCs w:val="18"/>
                 <w:rtl w:val="0"/>
               </w:rPr>
-              <w:t xml:space="preserve">343</w:t>
+              <w:t>337</w:t>
             </w:r>
           </w:p>
         </w:tc>

</xml_diff>